<commit_message>
updated lab domain name
</commit_message>
<xml_diff>
--- a/CYBER360-Ex-6.3-AD-Enumeration.docx
+++ b/CYBER360-Ex-6.3-AD-Enumeration.docx
@@ -369,7 +369,43 @@
           <w:sz w:val="22"/>
           <w:szCs w:val="22"/>
         </w:rPr>
-        <w:t>cit361-lab.cit.byui.edu</w:t>
+        <w:t>lab</w:t>
+      </w:r>
+      <w:r>
+        <w:rPr>
+          <w:b/>
+          <w:bCs/>
+          <w:sz w:val="22"/>
+          <w:szCs w:val="22"/>
+        </w:rPr>
+        <w:t>360</w:t>
+      </w:r>
+      <w:r>
+        <w:rPr>
+          <w:b/>
+          <w:bCs/>
+          <w:sz w:val="22"/>
+          <w:szCs w:val="22"/>
+        </w:rPr>
+        <w:t>.c</w:t>
+      </w:r>
+      <w:r>
+        <w:rPr>
+          <w:b/>
+          <w:bCs/>
+          <w:sz w:val="22"/>
+          <w:szCs w:val="22"/>
+        </w:rPr>
+        <w:t>se</w:t>
+      </w:r>
+      <w:r>
+        <w:rPr>
+          <w:b/>
+          <w:bCs/>
+          <w:sz w:val="22"/>
+          <w:szCs w:val="22"/>
+        </w:rPr>
+        <w:t>.byui.edu</w:t>
       </w:r>
       <w:r>
         <w:rPr>
@@ -422,21 +458,60 @@
           <w:sz w:val="22"/>
           <w:szCs w:val="22"/>
         </w:rPr>
-        <w:t xml:space="preserve"> accounts of the</w:t>
-      </w:r>
-      <w:r>
-        <w:rPr>
-          <w:sz w:val="22"/>
-          <w:szCs w:val="22"/>
-        </w:rPr>
-        <w:t xml:space="preserve"> the </w:t>
-      </w:r>
-      <w:r>
-        <w:rPr>
-          <w:sz w:val="22"/>
-          <w:szCs w:val="22"/>
-        </w:rPr>
-        <w:t>CIT361 lab’s Active Directory domain</w:t>
+        <w:t xml:space="preserve"> accounts of </w:t>
+      </w:r>
+      <w:proofErr w:type="gramStart"/>
+      <w:r>
+        <w:rPr>
+          <w:sz w:val="22"/>
+          <w:szCs w:val="22"/>
+        </w:rPr>
+        <w:t>the</w:t>
+      </w:r>
+      <w:r>
+        <w:rPr>
+          <w:sz w:val="22"/>
+          <w:szCs w:val="22"/>
+        </w:rPr>
+        <w:t xml:space="preserve"> </w:t>
+      </w:r>
+      <w:proofErr w:type="spellStart"/>
+      <w:r>
+        <w:rPr>
+          <w:sz w:val="22"/>
+          <w:szCs w:val="22"/>
+        </w:rPr>
+        <w:t>the</w:t>
+      </w:r>
+      <w:proofErr w:type="spellEnd"/>
+      <w:proofErr w:type="gramEnd"/>
+      <w:r>
+        <w:rPr>
+          <w:sz w:val="22"/>
+          <w:szCs w:val="22"/>
+        </w:rPr>
+        <w:t xml:space="preserve"> </w:t>
+      </w:r>
+      <w:r>
+        <w:rPr>
+          <w:sz w:val="22"/>
+          <w:szCs w:val="22"/>
+        </w:rPr>
+        <w:t>C</w:t>
+      </w:r>
+      <w:r>
+        <w:rPr>
+          <w:sz w:val="22"/>
+          <w:szCs w:val="22"/>
+        </w:rPr>
+        <w:t>YBER360</w:t>
+      </w:r>
+      <w:r>
+        <w:rPr>
+          <w:sz w:val="22"/>
+          <w:szCs w:val="22"/>
+        </w:rPr>
+        <w:t xml:space="preserve"> lab’s Active Directory domain</w:t>
       </w:r>
       <w:r>
         <w:rPr>
@@ -643,7 +718,29 @@
           <w:sz w:val="22"/>
           <w:szCs w:val="22"/>
         </w:rPr>
-        <w:t>$searcher = [System.DirectoryServices.DirectorySearcher]::new()</w:t>
+        <w:t>$searcher = [</w:t>
+      </w:r>
+      <w:proofErr w:type="gramStart"/>
+      <w:r>
+        <w:rPr>
+          <w:rFonts w:ascii="Consolas" w:hAnsi="Consolas"/>
+          <w:b/>
+          <w:bCs/>
+          <w:sz w:val="22"/>
+          <w:szCs w:val="22"/>
+        </w:rPr>
+        <w:t>System.DirectoryServices.DirectorySearcher]::new(</w:t>
+      </w:r>
+      <w:proofErr w:type="gramEnd"/>
+      <w:r>
+        <w:rPr>
+          <w:rFonts w:ascii="Consolas" w:hAnsi="Consolas"/>
+          <w:b/>
+          <w:bCs/>
+          <w:sz w:val="22"/>
+          <w:szCs w:val="22"/>
+        </w:rPr>
+        <w:t>)</w:t>
       </w:r>
       <w:r>
         <w:rPr>
@@ -1011,7 +1108,7 @@
           <w:sz w:val="22"/>
           <w:szCs w:val="22"/>
         </w:rPr>
-        <w:t>searcher.FindAll</w:t>
+        <w:t>searcher.FindAll()[</w:t>
       </w:r>
       <w:proofErr w:type="gramEnd"/>
       <w:r>
@@ -1020,8 +1117,36 @@
           <w:sz w:val="22"/>
           <w:szCs w:val="22"/>
         </w:rPr>
-        <w:t>()[0].GetType().Name</w:t>
-      </w:r>
+        <w:t>0</w:t>
+      </w:r>
+      <w:proofErr w:type="gramStart"/>
+      <w:r>
+        <w:rPr>
+          <w:rStyle w:val="CommandChar"/>
+          <w:sz w:val="22"/>
+          <w:szCs w:val="22"/>
+        </w:rPr>
+        <w:t>].GetType</w:t>
+      </w:r>
+      <w:proofErr w:type="gramEnd"/>
+      <w:r>
+        <w:rPr>
+          <w:rStyle w:val="CommandChar"/>
+          <w:sz w:val="22"/>
+          <w:szCs w:val="22"/>
+        </w:rPr>
+        <w:t>(</w:t>
+      </w:r>
+      <w:proofErr w:type="gramStart"/>
+      <w:r>
+        <w:rPr>
+          <w:rStyle w:val="CommandChar"/>
+          <w:sz w:val="22"/>
+          <w:szCs w:val="22"/>
+        </w:rPr>
+        <w:t>).Name</w:t>
+      </w:r>
+      <w:proofErr w:type="gramEnd"/>
       <w:r>
         <w:rPr>
           <w:sz w:val="22"/>
@@ -1129,7 +1254,7 @@
           <w:sz w:val="22"/>
           <w:szCs w:val="22"/>
         </w:rPr>
-        <w:t>searcher.FindAll</w:t>
+        <w:t>searcher.FindAll()[</w:t>
       </w:r>
       <w:proofErr w:type="gramEnd"/>
       <w:r>
@@ -1138,7 +1263,7 @@
           <w:sz w:val="22"/>
           <w:szCs w:val="22"/>
         </w:rPr>
-        <w:t>()[0] | Get-Member -MemberType Method</w:t>
+        <w:t>0] | Get-Member -MemberType Method</w:t>
       </w:r>
       <w:r>
         <w:rPr>
@@ -1288,7 +1413,7 @@
           <w:sz w:val="22"/>
           <w:szCs w:val="22"/>
         </w:rPr>
-        <w:t>searcher.FindAll</w:t>
+        <w:t>searcher.FindAll()[</w:t>
       </w:r>
       <w:proofErr w:type="gramEnd"/>
       <w:r>
@@ -1297,7 +1422,7 @@
           <w:sz w:val="22"/>
           <w:szCs w:val="22"/>
         </w:rPr>
-        <w:t>()[0] | Get-Member -MemberType Property</w:t>
+        <w:t>0] | Get-Member -MemberType Property</w:t>
       </w:r>
       <w:r>
         <w:rPr>
@@ -1572,7 +1697,29 @@
           <w:sz w:val="22"/>
           <w:szCs w:val="22"/>
         </w:rPr>
-        <w:t>Where-Object {$_.Path -match $MyUserName}</w:t>
+        <w:t>Where-Object {$</w:t>
+      </w:r>
+      <w:proofErr w:type="gramStart"/>
+      <w:r>
+        <w:rPr>
+          <w:rFonts w:ascii="Consolas" w:hAnsi="Consolas"/>
+          <w:b/>
+          <w:bCs/>
+          <w:sz w:val="22"/>
+          <w:szCs w:val="22"/>
+        </w:rPr>
+        <w:t>_.Path</w:t>
+      </w:r>
+      <w:proofErr w:type="gramEnd"/>
+      <w:r>
+        <w:rPr>
+          <w:rFonts w:ascii="Consolas" w:hAnsi="Consolas"/>
+          <w:b/>
+          <w:bCs/>
+          <w:sz w:val="22"/>
+          <w:szCs w:val="22"/>
+        </w:rPr>
+        <w:t xml:space="preserve"> -match $MyUserName}</w:t>
       </w:r>
       <w:r>
         <w:rPr>
@@ -1638,18 +1785,9 @@
           <w:sz w:val="22"/>
           <w:szCs w:val="22"/>
         </w:rPr>
-        <w:t xml:space="preserve"> the alias  </w:t>
-      </w:r>
-      <w:r>
-        <w:rPr>
-          <w:rFonts w:ascii="Consolas" w:hAnsi="Consolas"/>
-          <w:b/>
-          <w:bCs/>
-          <w:sz w:val="22"/>
-          <w:szCs w:val="22"/>
-        </w:rPr>
-        <w:t>?</w:t>
-      </w:r>
+        <w:t xml:space="preserve"> the </w:t>
+      </w:r>
+      <w:proofErr w:type="gramStart"/>
       <w:r>
         <w:rPr>
           <w:i/>
@@ -1657,9 +1795,19 @@
           <w:sz w:val="22"/>
           <w:szCs w:val="22"/>
         </w:rPr>
-        <w:t xml:space="preserve">  instead of the full </w:t>
-      </w:r>
-      <w:proofErr w:type="gramStart"/>
+        <w:t xml:space="preserve">alias  </w:t>
+      </w:r>
+      <w:r>
+        <w:rPr>
+          <w:rFonts w:ascii="Consolas" w:hAnsi="Consolas"/>
+          <w:b/>
+          <w:bCs/>
+          <w:sz w:val="22"/>
+          <w:szCs w:val="22"/>
+        </w:rPr>
+        <w:t>?</w:t>
+      </w:r>
+      <w:proofErr w:type="gramEnd"/>
       <w:r>
         <w:rPr>
           <w:i/>
@@ -1667,29 +1815,9 @@
           <w:sz w:val="22"/>
           <w:szCs w:val="22"/>
         </w:rPr>
-        <w:t xml:space="preserve">cmdlet  </w:t>
-      </w:r>
-      <w:r>
-        <w:rPr>
-          <w:rFonts w:ascii="Consolas" w:hAnsi="Consolas"/>
-          <w:b/>
-          <w:bCs/>
-          <w:sz w:val="22"/>
-          <w:szCs w:val="22"/>
-        </w:rPr>
-        <w:t>Where</w:t>
-      </w:r>
-      <w:proofErr w:type="gramEnd"/>
-      <w:r>
-        <w:rPr>
-          <w:rFonts w:ascii="Consolas" w:hAnsi="Consolas"/>
-          <w:b/>
-          <w:bCs/>
-          <w:sz w:val="22"/>
-          <w:szCs w:val="22"/>
-        </w:rPr>
-        <w:t>-Object</w:t>
-      </w:r>
+        <w:t xml:space="preserve">  instead of the full </w:t>
+      </w:r>
+      <w:proofErr w:type="gramStart"/>
       <w:r>
         <w:rPr>
           <w:i/>
@@ -1697,8 +1825,50 @@
           <w:sz w:val="22"/>
           <w:szCs w:val="22"/>
         </w:rPr>
+        <w:t xml:space="preserve">cmdlet  </w:t>
+      </w:r>
+      <w:r>
+        <w:rPr>
+          <w:rFonts w:ascii="Consolas" w:hAnsi="Consolas"/>
+          <w:b/>
+          <w:bCs/>
+          <w:sz w:val="22"/>
+          <w:szCs w:val="22"/>
+        </w:rPr>
+        <w:t>Where</w:t>
+      </w:r>
+      <w:proofErr w:type="gramEnd"/>
+      <w:r>
+        <w:rPr>
+          <w:rFonts w:ascii="Consolas" w:hAnsi="Consolas"/>
+          <w:b/>
+          <w:bCs/>
+          <w:sz w:val="22"/>
+          <w:szCs w:val="22"/>
+        </w:rPr>
+        <w:t>-</w:t>
+      </w:r>
+      <w:proofErr w:type="gramStart"/>
+      <w:r>
+        <w:rPr>
+          <w:rFonts w:ascii="Consolas" w:hAnsi="Consolas"/>
+          <w:b/>
+          <w:bCs/>
+          <w:sz w:val="22"/>
+          <w:szCs w:val="22"/>
+        </w:rPr>
+        <w:t>Object</w:t>
+      </w:r>
+      <w:r>
+        <w:rPr>
+          <w:i/>
+          <w:iCs/>
+          <w:sz w:val="22"/>
+          <w:szCs w:val="22"/>
+        </w:rPr>
         <w:t xml:space="preserve"> !</w:t>
       </w:r>
+      <w:proofErr w:type="gramEnd"/>
       <w:r>
         <w:rPr>
           <w:i/>
@@ -1797,8 +1967,42 @@
           <w:sz w:val="22"/>
           <w:szCs w:val="22"/>
         </w:rPr>
-        <w:t>() | Where-Object {$_.Path -match $MyUserName}).Path</w:t>
-      </w:r>
+        <w:t>() | Where-Object {$</w:t>
+      </w:r>
+      <w:proofErr w:type="gramStart"/>
+      <w:r>
+        <w:rPr>
+          <w:rFonts w:ascii="Consolas" w:hAnsi="Consolas"/>
+          <w:b/>
+          <w:bCs/>
+          <w:sz w:val="22"/>
+          <w:szCs w:val="22"/>
+        </w:rPr>
+        <w:t>_.Path</w:t>
+      </w:r>
+      <w:proofErr w:type="gramEnd"/>
+      <w:r>
+        <w:rPr>
+          <w:rFonts w:ascii="Consolas" w:hAnsi="Consolas"/>
+          <w:b/>
+          <w:bCs/>
+          <w:sz w:val="22"/>
+          <w:szCs w:val="22"/>
+        </w:rPr>
+        <w:t xml:space="preserve"> -match $MyUserName}</w:t>
+      </w:r>
+      <w:proofErr w:type="gramStart"/>
+      <w:r>
+        <w:rPr>
+          <w:rFonts w:ascii="Consolas" w:hAnsi="Consolas"/>
+          <w:b/>
+          <w:bCs/>
+          <w:sz w:val="22"/>
+          <w:szCs w:val="22"/>
+        </w:rPr>
+        <w:t>).Path</w:t>
+      </w:r>
+      <w:proofErr w:type="gramEnd"/>
       <w:r>
         <w:rPr>
           <w:sz w:val="22"/>
@@ -2377,8 +2581,42 @@
           <w:sz w:val="22"/>
           <w:szCs w:val="22"/>
         </w:rPr>
-        <w:t>() | Where-Object {$_.Path -match $MyUserName}).Properties</w:t>
-      </w:r>
+        <w:t>() | Where-Object {$</w:t>
+      </w:r>
+      <w:proofErr w:type="gramStart"/>
+      <w:r>
+        <w:rPr>
+          <w:rFonts w:ascii="Consolas" w:hAnsi="Consolas"/>
+          <w:b/>
+          <w:bCs/>
+          <w:sz w:val="22"/>
+          <w:szCs w:val="22"/>
+        </w:rPr>
+        <w:t>_.Path</w:t>
+      </w:r>
+      <w:proofErr w:type="gramEnd"/>
+      <w:r>
+        <w:rPr>
+          <w:rFonts w:ascii="Consolas" w:hAnsi="Consolas"/>
+          <w:b/>
+          <w:bCs/>
+          <w:sz w:val="22"/>
+          <w:szCs w:val="22"/>
+        </w:rPr>
+        <w:t xml:space="preserve"> -match $MyUserName}</w:t>
+      </w:r>
+      <w:proofErr w:type="gramStart"/>
+      <w:r>
+        <w:rPr>
+          <w:rFonts w:ascii="Consolas" w:hAnsi="Consolas"/>
+          <w:b/>
+          <w:bCs/>
+          <w:sz w:val="22"/>
+          <w:szCs w:val="22"/>
+        </w:rPr>
+        <w:t>).Properties</w:t>
+      </w:r>
+      <w:proofErr w:type="gramEnd"/>
       <w:r>
         <w:rPr>
           <w:sz w:val="22"/>
@@ -2727,7 +2965,16 @@
           <w:sz w:val="22"/>
           <w:szCs w:val="22"/>
         </w:rPr>
-        <w:t>(sAMAccountType=805306368)</w:t>
+        <w:t>(sAMAccountType=</w:t>
+      </w:r>
+      <w:proofErr w:type="gramStart"/>
+      <w:r>
+        <w:rPr>
+          <w:rStyle w:val="CommandChar"/>
+          <w:sz w:val="22"/>
+          <w:szCs w:val="22"/>
+        </w:rPr>
+        <w:t>805306368)</w:t>
       </w:r>
       <w:r>
         <w:rPr>
@@ -2739,6 +2986,7 @@
         </w:rPr>
         <w:t>(</w:t>
       </w:r>
+      <w:proofErr w:type="gramEnd"/>
       <w:r>
         <w:rPr>
           <w:rStyle w:val="CommandChar"/>
@@ -2769,14 +3017,23 @@
           <w:sz w:val="22"/>
           <w:szCs w:val="22"/>
         </w:rPr>
-        <w:t>$MyUserName</w:t>
-      </w:r>
+        <w:t>$</w:t>
+      </w:r>
+      <w:proofErr w:type="gramStart"/>
       <w:r>
         <w:rPr>
           <w:rStyle w:val="CommandChar"/>
           <w:sz w:val="22"/>
           <w:szCs w:val="22"/>
         </w:rPr>
+        <w:t>MyUserName</w:t>
+      </w:r>
+      <w:r>
+        <w:rPr>
+          <w:rStyle w:val="CommandChar"/>
+          <w:sz w:val="22"/>
+          <w:szCs w:val="22"/>
+        </w:rPr>
         <w:t>)</w:t>
       </w:r>
       <w:r>
@@ -2789,6 +3046,7 @@
         </w:rPr>
         <w:t>)</w:t>
       </w:r>
+      <w:proofErr w:type="gramEnd"/>
       <w:r>
         <w:rPr>
           <w:rFonts w:ascii="Consolas" w:hAnsi="Consolas" w:cs="Lucida Console"/>
@@ -2825,6 +3083,7 @@
         </w:rPr>
         <w:t>$</w:t>
       </w:r>
+      <w:proofErr w:type="gramStart"/>
       <w:r>
         <w:rPr>
           <w:rFonts w:ascii="Consolas" w:hAnsi="Consolas" w:cstheme="minorHAnsi"/>
@@ -2833,8 +3092,31 @@
           <w:sz w:val="22"/>
           <w:szCs w:val="22"/>
         </w:rPr>
-        <w:t>searcher.FindAll().Properties</w:t>
-      </w:r>
+        <w:t>searcher.FindAll</w:t>
+      </w:r>
+      <w:proofErr w:type="gramEnd"/>
+      <w:r>
+        <w:rPr>
+          <w:rFonts w:ascii="Consolas" w:hAnsi="Consolas" w:cstheme="minorHAnsi"/>
+          <w:b/>
+          <w:bCs/>
+          <w:sz w:val="22"/>
+          <w:szCs w:val="22"/>
+        </w:rPr>
+        <w:t>(</w:t>
+      </w:r>
+      <w:proofErr w:type="gramStart"/>
+      <w:r>
+        <w:rPr>
+          <w:rFonts w:ascii="Consolas" w:hAnsi="Consolas" w:cstheme="minorHAnsi"/>
+          <w:b/>
+          <w:bCs/>
+          <w:sz w:val="22"/>
+          <w:szCs w:val="22"/>
+        </w:rPr>
+        <w:t>).Properties</w:t>
+      </w:r>
+      <w:proofErr w:type="gramEnd"/>
       <w:r>
         <w:rPr>
           <w:rFonts w:cstheme="minorHAnsi"/>
@@ -3155,6 +3437,7 @@
         </w:rPr>
         <w:t xml:space="preserve">  </w:t>
       </w:r>
+      <w:proofErr w:type="gramStart"/>
       <w:r>
         <w:rPr>
           <w:rStyle w:val="CommandChar"/>
@@ -3183,7 +3466,19 @@
           <w:sz w:val="22"/>
           <w:szCs w:val="22"/>
         </w:rPr>
-        <w:t>quals &lt;your</w:t>
+        <w:t>quals</w:t>
+      </w:r>
+      <w:proofErr w:type="gramEnd"/>
+      <w:r>
+        <w:rPr>
+          <w:rStyle w:val="CommandChar"/>
+          <w:rFonts w:asciiTheme="minorHAnsi" w:hAnsiTheme="minorHAnsi" w:cstheme="minorHAnsi"/>
+          <w:b w:val="0"/>
+          <w:bCs/>
+          <w:sz w:val="22"/>
+          <w:szCs w:val="22"/>
+        </w:rPr>
+        <w:t xml:space="preserve"> &lt;your</w:t>
       </w:r>
       <w:r>
         <w:rPr>
@@ -3606,7 +3901,16 @@
           <w:sz w:val="22"/>
           <w:szCs w:val="22"/>
         </w:rPr>
-        <w:t>ype=805306368)</w:t>
+        <w:t>ype=</w:t>
+      </w:r>
+      <w:proofErr w:type="gramStart"/>
+      <w:r>
+        <w:rPr>
+          <w:rStyle w:val="CommandChar"/>
+          <w:sz w:val="22"/>
+          <w:szCs w:val="22"/>
+        </w:rPr>
+        <w:t>805306368)</w:t>
       </w:r>
       <w:r>
         <w:rPr>
@@ -3618,6 +3922,7 @@
         </w:rPr>
         <w:t>(</w:t>
       </w:r>
+      <w:proofErr w:type="gramEnd"/>
       <w:r>
         <w:rPr>
           <w:rStyle w:val="CommandChar"/>
@@ -3686,7 +3991,29 @@
           <w:sz w:val="22"/>
           <w:szCs w:val="22"/>
         </w:rPr>
-        <w:t>$searcher.FindAll()</w:t>
+        <w:t>$</w:t>
+      </w:r>
+      <w:proofErr w:type="gramStart"/>
+      <w:r>
+        <w:rPr>
+          <w:rFonts w:ascii="Consolas" w:hAnsi="Consolas" w:cstheme="minorHAnsi"/>
+          <w:b/>
+          <w:bCs/>
+          <w:sz w:val="22"/>
+          <w:szCs w:val="22"/>
+        </w:rPr>
+        <w:t>searcher.FindAll</w:t>
+      </w:r>
+      <w:proofErr w:type="gramEnd"/>
+      <w:r>
+        <w:rPr>
+          <w:rFonts w:ascii="Consolas" w:hAnsi="Consolas" w:cstheme="minorHAnsi"/>
+          <w:b/>
+          <w:bCs/>
+          <w:sz w:val="22"/>
+          <w:szCs w:val="22"/>
+        </w:rPr>
+        <w:t>()</w:t>
       </w:r>
       <w:r>
         <w:rPr>
@@ -4448,8 +4775,20 @@
           <w:sz w:val="22"/>
           <w:szCs w:val="22"/>
         </w:rPr>
-        <w:t>().FullName</w:t>
-      </w:r>
+        <w:t>(</w:t>
+      </w:r>
+      <w:proofErr w:type="gramStart"/>
+      <w:r>
+        <w:rPr>
+          <w:rFonts w:ascii="Consolas" w:hAnsi="Consolas" w:cstheme="minorHAnsi"/>
+          <w:b/>
+          <w:bCs/>
+          <w:sz w:val="22"/>
+          <w:szCs w:val="22"/>
+        </w:rPr>
+        <w:t>).FullName</w:t>
+      </w:r>
+      <w:proofErr w:type="gramEnd"/>
       <w:r>
         <w:rPr>
           <w:rFonts w:cstheme="minorHAnsi"/>
@@ -4872,15 +5211,16 @@
           <w:sz w:val="22"/>
           <w:szCs w:val="22"/>
         </w:rPr>
-        <w:t>'LDAP://OU=Students,</w:t>
-      </w:r>
+        <w:t>'LDAP://OU=</w:t>
+      </w:r>
+      <w:proofErr w:type="spellStart"/>
       <w:r>
         <w:rPr>
           <w:rStyle w:val="CommandChar"/>
           <w:sz w:val="22"/>
           <w:szCs w:val="22"/>
         </w:rPr>
-        <w:t>DC=cit361,DC=com</w:t>
+        <w:t>Students,</w:t>
       </w:r>
       <w:r>
         <w:rPr>
@@ -4888,6 +5228,47 @@
           <w:sz w:val="22"/>
           <w:szCs w:val="22"/>
         </w:rPr>
+        <w:t>DC</w:t>
+      </w:r>
+      <w:proofErr w:type="spellEnd"/>
+      <w:r>
+        <w:rPr>
+          <w:rStyle w:val="CommandChar"/>
+          <w:sz w:val="22"/>
+          <w:szCs w:val="22"/>
+        </w:rPr>
+        <w:t>=c</w:t>
+      </w:r>
+      <w:r>
+        <w:rPr>
+          <w:rStyle w:val="CommandChar"/>
+          <w:sz w:val="22"/>
+          <w:szCs w:val="22"/>
+        </w:rPr>
+        <w:t>yber360</w:t>
+      </w:r>
+      <w:r>
+        <w:rPr>
+          <w:rStyle w:val="CommandChar"/>
+          <w:sz w:val="22"/>
+          <w:szCs w:val="22"/>
+        </w:rPr>
+        <w:t>,DC=</w:t>
+      </w:r>
+      <w:r>
+        <w:rPr>
+          <w:rStyle w:val="CommandChar"/>
+          <w:sz w:val="22"/>
+          <w:szCs w:val="22"/>
+        </w:rPr>
+        <w:t>lan</w:t>
+      </w:r>
+      <w:r>
+        <w:rPr>
+          <w:rStyle w:val="CommandChar"/>
+          <w:sz w:val="22"/>
+          <w:szCs w:val="22"/>
+        </w:rPr>
         <w:t>'</w:t>
       </w:r>
       <w:r>
@@ -4912,8 +5293,31 @@
           <w:sz w:val="22"/>
           <w:szCs w:val="22"/>
         </w:rPr>
-        <w:t>$ou = [</w:t>
-      </w:r>
+        <w:t>$</w:t>
+      </w:r>
+      <w:proofErr w:type="spellStart"/>
+      <w:r>
+        <w:rPr>
+          <w:rFonts w:ascii="Consolas" w:hAnsi="Consolas"/>
+          <w:b/>
+          <w:bCs/>
+          <w:sz w:val="22"/>
+          <w:szCs w:val="22"/>
+        </w:rPr>
+        <w:t>ou</w:t>
+      </w:r>
+      <w:proofErr w:type="spellEnd"/>
+      <w:r>
+        <w:rPr>
+          <w:rFonts w:ascii="Consolas" w:hAnsi="Consolas"/>
+          <w:b/>
+          <w:bCs/>
+          <w:sz w:val="22"/>
+          <w:szCs w:val="22"/>
+        </w:rPr>
+        <w:t xml:space="preserve"> = [</w:t>
+      </w:r>
+      <w:proofErr w:type="spellStart"/>
       <w:proofErr w:type="gramStart"/>
       <w:r>
         <w:rPr>
@@ -4925,6 +5329,7 @@
         </w:rPr>
         <w:t>System.DirectoryServices.DirectorySearcher</w:t>
       </w:r>
+      <w:proofErr w:type="spellEnd"/>
       <w:proofErr w:type="gramEnd"/>
       <w:r>
         <w:rPr>
@@ -4958,8 +5363,9 @@
           <w:sz w:val="22"/>
           <w:szCs w:val="22"/>
         </w:rPr>
-        <w:t>$ou.</w:t>
-      </w:r>
+        <w:t>$</w:t>
+      </w:r>
+      <w:proofErr w:type="gramStart"/>
       <w:r>
         <w:rPr>
           <w:rFonts w:ascii="Consolas" w:hAnsi="Consolas"/>
@@ -4968,6 +5374,16 @@
           <w:sz w:val="22"/>
           <w:szCs w:val="22"/>
         </w:rPr>
+        <w:t>ou.</w:t>
+      </w:r>
+      <w:r>
+        <w:rPr>
+          <w:rFonts w:ascii="Consolas" w:hAnsi="Consolas"/>
+          <w:b/>
+          <w:bCs/>
+          <w:sz w:val="22"/>
+          <w:szCs w:val="22"/>
+        </w:rPr>
         <w:t>SearchRoot.</w:t>
       </w:r>
       <w:r>
@@ -4980,6 +5396,7 @@
         </w:rPr>
         <w:t>Children</w:t>
       </w:r>
+      <w:proofErr w:type="gramEnd"/>
       <w:r>
         <w:rPr>
           <w:sz w:val="22"/>
@@ -5187,7 +5604,57 @@
           <w:sz w:val="22"/>
           <w:szCs w:val="22"/>
         </w:rPr>
-        <w:t>'LDAP://OU=Students,DC=cit361,DC=com'</w:t>
+        <w:t>'LDAP://OU=</w:t>
+      </w:r>
+      <w:proofErr w:type="spellStart"/>
+      <w:r>
+        <w:rPr>
+          <w:rStyle w:val="CommandChar"/>
+          <w:sz w:val="22"/>
+          <w:szCs w:val="22"/>
+        </w:rPr>
+        <w:t>Students,DC</w:t>
+      </w:r>
+      <w:proofErr w:type="spellEnd"/>
+      <w:r>
+        <w:rPr>
+          <w:rStyle w:val="CommandChar"/>
+          <w:sz w:val="22"/>
+          <w:szCs w:val="22"/>
+        </w:rPr>
+        <w:t>=c</w:t>
+      </w:r>
+      <w:r>
+        <w:rPr>
+          <w:rStyle w:val="CommandChar"/>
+          <w:sz w:val="22"/>
+          <w:szCs w:val="22"/>
+        </w:rPr>
+        <w:t>yber360</w:t>
+      </w:r>
+      <w:r>
+        <w:rPr>
+          <w:rStyle w:val="CommandChar"/>
+          <w:sz w:val="22"/>
+          <w:szCs w:val="22"/>
+        </w:rPr>
+        <w:t>,DC=</w:t>
+      </w:r>
+      <w:r>
+        <w:rPr>
+          <w:rStyle w:val="CommandChar"/>
+          <w:sz w:val="22"/>
+          <w:szCs w:val="22"/>
+        </w:rPr>
+        <w:t>lan</w:t>
+      </w:r>
+      <w:r>
+        <w:rPr>
+          <w:rStyle w:val="CommandChar"/>
+          <w:sz w:val="22"/>
+          <w:szCs w:val="22"/>
+        </w:rPr>
+        <w:t>'</w:t>
       </w:r>
       <w:r>
         <w:rPr>
@@ -5211,8 +5678,9 @@
           <w:sz w:val="22"/>
           <w:szCs w:val="22"/>
         </w:rPr>
-        <w:t>$ou = [</w:t>
-      </w:r>
+        <w:t>$</w:t>
+      </w:r>
+      <w:proofErr w:type="spellStart"/>
       <w:r>
         <w:rPr>
           <w:rFonts w:ascii="Consolas" w:hAnsi="Consolas"/>
@@ -5221,8 +5689,31 @@
           <w:sz w:val="22"/>
           <w:szCs w:val="22"/>
         </w:rPr>
+        <w:t>ou</w:t>
+      </w:r>
+      <w:proofErr w:type="spellEnd"/>
+      <w:r>
+        <w:rPr>
+          <w:rFonts w:ascii="Consolas" w:hAnsi="Consolas"/>
+          <w:b/>
+          <w:bCs/>
+          <w:sz w:val="22"/>
+          <w:szCs w:val="22"/>
+        </w:rPr>
+        <w:t xml:space="preserve"> = [</w:t>
+      </w:r>
+      <w:proofErr w:type="spellStart"/>
+      <w:r>
+        <w:rPr>
+          <w:rFonts w:ascii="Consolas" w:hAnsi="Consolas"/>
+          <w:b/>
+          <w:bCs/>
+          <w:sz w:val="22"/>
+          <w:szCs w:val="22"/>
+        </w:rPr>
         <w:t>adsi</w:t>
       </w:r>
+      <w:proofErr w:type="spellEnd"/>
       <w:r>
         <w:rPr>
           <w:rFonts w:ascii="Consolas" w:hAnsi="Consolas"/>
@@ -5616,7 +6107,39 @@
           <w:sz w:val="22"/>
           <w:szCs w:val="22"/>
         </w:rPr>
-        <w:t>'LDAP://DC=cit361,DC=com'</w:t>
+        <w:t>'LDAP://DC=c</w:t>
+      </w:r>
+      <w:r>
+        <w:rPr>
+          <w:rStyle w:val="CommandChar"/>
+          <w:sz w:val="22"/>
+          <w:szCs w:val="22"/>
+        </w:rPr>
+        <w:t>yber360</w:t>
+      </w:r>
+      <w:r>
+        <w:rPr>
+          <w:rStyle w:val="CommandChar"/>
+          <w:sz w:val="22"/>
+          <w:szCs w:val="22"/>
+        </w:rPr>
+        <w:t>,DC=</w:t>
+      </w:r>
+      <w:r>
+        <w:rPr>
+          <w:rStyle w:val="CommandChar"/>
+          <w:sz w:val="22"/>
+          <w:szCs w:val="22"/>
+        </w:rPr>
+        <w:t>lan</w:t>
+      </w:r>
+      <w:r>
+        <w:rPr>
+          <w:rStyle w:val="CommandChar"/>
+          <w:sz w:val="22"/>
+          <w:szCs w:val="22"/>
+        </w:rPr>
+        <w:t>'</w:t>
       </w:r>
       <w:r>
         <w:rPr>
@@ -5640,7 +6163,29 @@
           <w:sz w:val="22"/>
           <w:szCs w:val="22"/>
         </w:rPr>
-        <w:t>$domain = [adsi]$dn</w:t>
+        <w:t>$domain = [</w:t>
+      </w:r>
+      <w:proofErr w:type="spellStart"/>
+      <w:r>
+        <w:rPr>
+          <w:rFonts w:ascii="Consolas" w:hAnsi="Consolas"/>
+          <w:b/>
+          <w:bCs/>
+          <w:sz w:val="22"/>
+          <w:szCs w:val="22"/>
+        </w:rPr>
+        <w:t>adsi</w:t>
+      </w:r>
+      <w:proofErr w:type="spellEnd"/>
+      <w:r>
+        <w:rPr>
+          <w:rFonts w:ascii="Consolas" w:hAnsi="Consolas"/>
+          <w:b/>
+          <w:bCs/>
+          <w:sz w:val="22"/>
+          <w:szCs w:val="22"/>
+        </w:rPr>
+        <w:t>]$dn</w:t>
       </w:r>
       <w:r>
         <w:rPr>
@@ -5807,7 +6352,39 @@
           <w:sz w:val="22"/>
           <w:szCs w:val="22"/>
         </w:rPr>
-        <w:t>'LDAP://DC=cit361,DC=com'</w:t>
+        <w:t>'LDAP://DC=c</w:t>
+      </w:r>
+      <w:r>
+        <w:rPr>
+          <w:rStyle w:val="CommandChar"/>
+          <w:sz w:val="22"/>
+          <w:szCs w:val="22"/>
+        </w:rPr>
+        <w:t>yber360</w:t>
+      </w:r>
+      <w:r>
+        <w:rPr>
+          <w:rStyle w:val="CommandChar"/>
+          <w:sz w:val="22"/>
+          <w:szCs w:val="22"/>
+        </w:rPr>
+        <w:t>,DC=</w:t>
+      </w:r>
+      <w:r>
+        <w:rPr>
+          <w:rStyle w:val="CommandChar"/>
+          <w:sz w:val="22"/>
+          <w:szCs w:val="22"/>
+        </w:rPr>
+        <w:t>lan</w:t>
+      </w:r>
+      <w:r>
+        <w:rPr>
+          <w:rStyle w:val="CommandChar"/>
+          <w:sz w:val="22"/>
+          <w:szCs w:val="22"/>
+        </w:rPr>
+        <w:t>'</w:t>
       </w:r>
       <w:r>
         <w:rPr>
@@ -5833,6 +6410,7 @@
         </w:rPr>
         <w:t>$</w:t>
       </w:r>
+      <w:proofErr w:type="spellStart"/>
       <w:r>
         <w:rPr>
           <w:rFonts w:ascii="Consolas" w:hAnsi="Consolas"/>
@@ -5841,7 +6419,18 @@
           <w:sz w:val="22"/>
           <w:szCs w:val="22"/>
         </w:rPr>
-        <w:t xml:space="preserve">gpoFilter = </w:t>
+        <w:t>gpoFilter</w:t>
+      </w:r>
+      <w:proofErr w:type="spellEnd"/>
+      <w:r>
+        <w:rPr>
+          <w:rFonts w:ascii="Consolas" w:hAnsi="Consolas"/>
+          <w:b/>
+          <w:bCs/>
+          <w:sz w:val="22"/>
+          <w:szCs w:val="22"/>
+        </w:rPr>
+        <w:t xml:space="preserve"> = </w:t>
       </w:r>
       <w:r>
         <w:rPr>
@@ -5849,7 +6438,43 @@
           <w:sz w:val="22"/>
           <w:szCs w:val="22"/>
         </w:rPr>
-        <w:t>'(objectCategory=groupPolicyContainer)'</w:t>
+        <w:t>'(</w:t>
+      </w:r>
+      <w:proofErr w:type="spellStart"/>
+      <w:r>
+        <w:rPr>
+          <w:rStyle w:val="CommandChar"/>
+          <w:sz w:val="22"/>
+          <w:szCs w:val="22"/>
+        </w:rPr>
+        <w:t>objectCategory</w:t>
+      </w:r>
+      <w:proofErr w:type="spellEnd"/>
+      <w:r>
+        <w:rPr>
+          <w:rStyle w:val="CommandChar"/>
+          <w:sz w:val="22"/>
+          <w:szCs w:val="22"/>
+        </w:rPr>
+        <w:t>=</w:t>
+      </w:r>
+      <w:proofErr w:type="spellStart"/>
+      <w:r>
+        <w:rPr>
+          <w:rStyle w:val="CommandChar"/>
+          <w:sz w:val="22"/>
+          <w:szCs w:val="22"/>
+        </w:rPr>
+        <w:t>groupPolicyContainer</w:t>
+      </w:r>
+      <w:proofErr w:type="spellEnd"/>
+      <w:r>
+        <w:rPr>
+          <w:rStyle w:val="CommandChar"/>
+          <w:sz w:val="22"/>
+          <w:szCs w:val="22"/>
+        </w:rPr>
+        <w:t>)'</w:t>
       </w:r>
       <w:r>
         <w:rPr>
@@ -5896,7 +6521,6 @@
         </w:rPr>
         <w:t>$</w:t>
       </w:r>
-      <w:proofErr w:type="gramStart"/>
       <w:r>
         <w:rPr>
           <w:rFonts w:ascii="Consolas" w:hAnsi="Consolas"/>
@@ -5907,7 +6531,6 @@
         </w:rPr>
         <w:t>searcher.SearchRoot</w:t>
       </w:r>
-      <w:proofErr w:type="gramEnd"/>
       <w:r>
         <w:rPr>
           <w:rFonts w:ascii="Consolas" w:hAnsi="Consolas"/>
@@ -6161,7 +6784,29 @@
           <w:sz w:val="22"/>
           <w:szCs w:val="22"/>
         </w:rPr>
-        <w:t>cn=*))'</w:t>
+        <w:t>cn</w:t>
+      </w:r>
+      <w:proofErr w:type="gramStart"/>
+      <w:r>
+        <w:rPr>
+          <w:rFonts w:ascii="Consolas" w:hAnsi="Consolas"/>
+          <w:b/>
+          <w:bCs/>
+          <w:sz w:val="22"/>
+          <w:szCs w:val="22"/>
+        </w:rPr>
+        <w:t>=*)</w:t>
+      </w:r>
+      <w:proofErr w:type="gramEnd"/>
+      <w:r>
+        <w:rPr>
+          <w:rFonts w:ascii="Consolas" w:hAnsi="Consolas"/>
+          <w:b/>
+          <w:bCs/>
+          <w:sz w:val="22"/>
+          <w:szCs w:val="22"/>
+        </w:rPr>
+        <w:t>)'</w:t>
       </w:r>
       <w:r>
         <w:rPr>
@@ -6185,8 +6830,42 @@
           <w:sz w:val="22"/>
           <w:szCs w:val="22"/>
         </w:rPr>
-        <w:t>([adsisearcher]$filt).FindAll().Properties.name</w:t>
-      </w:r>
+        <w:t>([adsisearcher]$filt</w:t>
+      </w:r>
+      <w:proofErr w:type="gramStart"/>
+      <w:r>
+        <w:rPr>
+          <w:rFonts w:ascii="Consolas" w:hAnsi="Consolas"/>
+          <w:b/>
+          <w:bCs/>
+          <w:sz w:val="22"/>
+          <w:szCs w:val="22"/>
+        </w:rPr>
+        <w:t>).FindAll</w:t>
+      </w:r>
+      <w:proofErr w:type="gramEnd"/>
+      <w:r>
+        <w:rPr>
+          <w:rFonts w:ascii="Consolas" w:hAnsi="Consolas"/>
+          <w:b/>
+          <w:bCs/>
+          <w:sz w:val="22"/>
+          <w:szCs w:val="22"/>
+        </w:rPr>
+        <w:t>(</w:t>
+      </w:r>
+      <w:proofErr w:type="gramStart"/>
+      <w:r>
+        <w:rPr>
+          <w:rFonts w:ascii="Consolas" w:hAnsi="Consolas"/>
+          <w:b/>
+          <w:bCs/>
+          <w:sz w:val="22"/>
+          <w:szCs w:val="22"/>
+        </w:rPr>
+        <w:t>).Properties.name</w:t>
+      </w:r>
+      <w:proofErr w:type="gramEnd"/>
       <w:r>
         <w:rPr>
           <w:sz w:val="22"/>
@@ -6960,7 +7639,57 @@
           <w:sz w:val="22"/>
           <w:szCs w:val="22"/>
         </w:rPr>
-        <w:t>=cit361,DC=com' -Filter *</w:t>
+        <w:t>=c</w:t>
+      </w:r>
+      <w:r>
+        <w:rPr>
+          <w:rStyle w:val="CommandChar"/>
+          <w:sz w:val="22"/>
+          <w:szCs w:val="22"/>
+        </w:rPr>
+        <w:t>yber</w:t>
+      </w:r>
+      <w:proofErr w:type="gramStart"/>
+      <w:r>
+        <w:rPr>
+          <w:rStyle w:val="CommandChar"/>
+          <w:sz w:val="22"/>
+          <w:szCs w:val="22"/>
+        </w:rPr>
+        <w:t>360</w:t>
+      </w:r>
+      <w:r>
+        <w:rPr>
+          <w:rStyle w:val="CommandChar"/>
+          <w:sz w:val="22"/>
+          <w:szCs w:val="22"/>
+        </w:rPr>
+        <w:t>,DC</w:t>
+      </w:r>
+      <w:proofErr w:type="gramEnd"/>
+      <w:r>
+        <w:rPr>
+          <w:rStyle w:val="CommandChar"/>
+          <w:sz w:val="22"/>
+          <w:szCs w:val="22"/>
+        </w:rPr>
+        <w:t>=</w:t>
+      </w:r>
+      <w:r>
+        <w:rPr>
+          <w:rStyle w:val="CommandChar"/>
+          <w:sz w:val="22"/>
+          <w:szCs w:val="22"/>
+        </w:rPr>
+        <w:t>lan</w:t>
+      </w:r>
+      <w:r>
+        <w:rPr>
+          <w:rStyle w:val="CommandChar"/>
+          <w:sz w:val="22"/>
+          <w:szCs w:val="22"/>
+        </w:rPr>
+        <w:t>' -Filter *</w:t>
       </w:r>
       <w:r>
         <w:rPr>
@@ -6984,8 +7713,20 @@
           <w:sz w:val="22"/>
           <w:szCs w:val="22"/>
         </w:rPr>
-        <w:t>$pgs.Name</w:t>
-      </w:r>
+        <w:t>$</w:t>
+      </w:r>
+      <w:proofErr w:type="gramStart"/>
+      <w:r>
+        <w:rPr>
+          <w:rFonts w:ascii="Consolas" w:hAnsi="Consolas"/>
+          <w:b/>
+          <w:bCs/>
+          <w:sz w:val="22"/>
+          <w:szCs w:val="22"/>
+        </w:rPr>
+        <w:t>pgs.Name</w:t>
+      </w:r>
+      <w:proofErr w:type="gramEnd"/>
       <w:r>
         <w:rPr>
           <w:sz w:val="22"/>
@@ -7317,7 +8058,7 @@
         <w:sz w:val="16"/>
         <w:szCs w:val="18"/>
       </w:rPr>
-      <w:t>2025</w:t>
+      <w:t>2026</w:t>
     </w:r>
     <w:r>
       <w:rPr>
@@ -11811,6 +12552,7 @@
     <w:rsid w:val="00155098"/>
     <w:rsid w:val="00183BD9"/>
     <w:rsid w:val="001A69D3"/>
+    <w:rsid w:val="001C7691"/>
     <w:rsid w:val="00200A90"/>
     <w:rsid w:val="00230F4B"/>
     <w:rsid w:val="00260767"/>
@@ -11836,6 +12578,7 @@
     <w:rsid w:val="005E05D2"/>
     <w:rsid w:val="005E588A"/>
     <w:rsid w:val="00623C03"/>
+    <w:rsid w:val="00624790"/>
     <w:rsid w:val="006B3BB2"/>
     <w:rsid w:val="00745000"/>
     <w:rsid w:val="00773647"/>

</xml_diff>